<commit_message>
Wire public repository URL into Appendix C, [S28], README
Co-Authored-By: Claude Fable 5 <noreply@anthropic.com>
</commit_message>
<xml_diff>
--- a/docs/Recursive_Industrial_Intelligence_3rd_Ed_r3.4.docx
+++ b/docs/Recursive_Industrial_Intelligence_3rd_Ed_r3.4.docx
@@ -14407,73 +14407,113 @@
           <w:b/>
           <w:bCs/>
         </w:rPr>
-        <w:t xml:space="preserve">Archival status (pre-publication requirement, not yet satisfied).</w:t>
-      </w:r>
-      <w:r>
-        <w:t xml:space="preserve"> </w:t>
-      </w:r>
-      <w:r>
-        <w:t xml:space="preserve">The</w:t>
-      </w:r>
-      <w:r>
-        <w:t xml:space="preserve"> </w:t>
-      </w:r>
-      <w:r>
-        <w:t xml:space="preserve">repository accompanying this draft is local. Before circulation as a</w:t>
-      </w:r>
-      <w:r>
-        <w:t xml:space="preserve"> </w:t>
-      </w:r>
-      <w:r>
-        <w:t xml:space="preserve">citable artifact, [S28] must acquire: a permanent public repository URL</w:t>
-      </w:r>
-      <w:r>
-        <w:t xml:space="preserve"> </w:t>
-      </w:r>
-      <w:r>
-        <w:t xml:space="preserve">with a tagged release and commit hash; an archived snapshot with DOI</w:t>
-      </w:r>
-      <w:r>
-        <w:t xml:space="preserve"> </w:t>
-      </w:r>
-      <w:r>
-        <w:t xml:space="preserve">(Zenodo/OSF); a dependency lockfile recording exact NumPy/SciPy versions;</w:t>
-      </w:r>
-      <w:r>
-        <w:t xml:space="preserve"> </w:t>
-      </w:r>
-      <w:r>
-        <w:t xml:space="preserve">a license; and a statement of the runtime environment. Until then,</w:t>
-      </w:r>
-      <w:r>
-        <w:t xml:space="preserve"> </w:t>
-      </w:r>
-      <w:r>
-        <w:t xml:space="preserve">“open</w:t>
-      </w:r>
-      <w:r>
-        <w:t xml:space="preserve"> </w:t>
-      </w:r>
-      <w:r>
-        <w:t xml:space="preserve">model”</w:t>
-      </w:r>
-      <w:r>
-        <w:t xml:space="preserve"> </w:t>
-      </w:r>
-      <w:r>
-        <w:t xml:space="preserve">is a statement of intent, and the 35 tests establish only that the</w:t>
-      </w:r>
-      <w:r>
-        <w:t xml:space="preserve"> </w:t>
-      </w:r>
-      <w:r>
-        <w:t xml:space="preserve">implementation matches its specification — not that the specification</w:t>
-      </w:r>
-      <w:r>
-        <w:t xml:space="preserve"> </w:t>
-      </w:r>
-      <w:r>
-        <w:t xml:space="preserve">adequately represents industrial reality.</w:t>
+        <w:t xml:space="preserve">Archival status.</w:t>
+      </w:r>
+      <w:r>
+        <w:t xml:space="preserve"> </w:t>
+      </w:r>
+      <w:r>
+        <w:t xml:space="preserve">Public repository:</w:t>
+      </w:r>
+      <w:r>
+        <w:t xml:space="preserve"> </w:t>
+      </w:r>
+      <w:r>
+        <w:rPr>
+          <w:b/>
+          <w:bCs/>
+        </w:rPr>
+        <w:t xml:space="preserve">https://github.com/fperegrinvs/rsi-model</w:t>
+      </w:r>
+      <w:r>
+        <w:t xml:space="preserve">, release tag</w:t>
+      </w:r>
+      <w:r>
+        <w:t xml:space="preserve"> </w:t>
+      </w:r>
+      <w:r>
+        <w:rPr>
+          <w:rStyle w:val="VerbatimChar"/>
+        </w:rPr>
+        <w:t xml:space="preserve">r3.4</w:t>
+      </w:r>
+      <w:r>
+        <w:t xml:space="preserve">, branch</w:t>
+      </w:r>
+      <w:r>
+        <w:t xml:space="preserve"> </w:t>
+      </w:r>
+      <w:r>
+        <w:rPr>
+          <w:rStyle w:val="VerbatimChar"/>
+        </w:rPr>
+        <w:t xml:space="preserve">main</w:t>
+      </w:r>
+      <w:r>
+        <w:t xml:space="preserve">. Dependency lockfile:</w:t>
+      </w:r>
+      <w:r>
+        <w:t xml:space="preserve"> </w:t>
+      </w:r>
+      <w:r>
+        <w:rPr>
+          <w:rStyle w:val="VerbatimChar"/>
+        </w:rPr>
+        <w:t xml:space="preserve">requirements.lock</w:t>
+      </w:r>
+      <w:r>
+        <w:t xml:space="preserve"> </w:t>
+      </w:r>
+      <w:r>
+        <w:t xml:space="preserve">(numpy 2.1.3, scipy</w:t>
+      </w:r>
+      <w:r>
+        <w:t xml:space="preserve"> </w:t>
+      </w:r>
+      <w:r>
+        <w:t xml:space="preserve">1.16.0 [HiGHS via scipy.optimize.linprog], PyYAML 6.0.3, matplotlib</w:t>
+      </w:r>
+      <w:r>
+        <w:t xml:space="preserve"> </w:t>
+      </w:r>
+      <w:r>
+        <w:t xml:space="preserve">3.10.3, pytest 9.0.2; Python 3.12.7, macOS/arm64). Citation metadata:</w:t>
+      </w:r>
+      <w:r>
+        <w:t xml:space="preserve"> </w:t>
+      </w:r>
+      <w:r>
+        <w:rPr>
+          <w:rStyle w:val="VerbatimChar"/>
+        </w:rPr>
+        <w:t xml:space="preserve">CITATION.cff</w:t>
+      </w:r>
+      <w:r>
+        <w:t xml:space="preserve">. Still pending: a license (the repository is currently</w:t>
+      </w:r>
+      <w:r>
+        <w:t xml:space="preserve"> </w:t>
+      </w:r>
+      <w:r>
+        <w:t xml:space="preserve">all-rights-reserved by default) and an archived DOI snapshot</w:t>
+      </w:r>
+      <w:r>
+        <w:t xml:space="preserve"> </w:t>
+      </w:r>
+      <w:r>
+        <w:t xml:space="preserve">(Zenodo/OSF). The 35 tests establish that the implementation matches its</w:t>
+      </w:r>
+      <w:r>
+        <w:t xml:space="preserve"> </w:t>
+      </w:r>
+      <w:r>
+        <w:t xml:space="preserve">specification — not that the specification adequately represents</w:t>
+      </w:r>
+      <w:r>
+        <w:t xml:space="preserve"> </w:t>
+      </w:r>
+      <w:r>
+        <w:t xml:space="preserve">industrial reality.</w:t>
       </w:r>
     </w:p>
     <w:bookmarkEnd w:id="49"/>
@@ -17461,7 +17501,19 @@
         <w:t xml:space="preserve"> </w:t>
       </w:r>
       <w:r>
-        <w:t xml:space="preserve">shortfall; ~1,000 automated collision-avoidance maneuvers/day. [S28] Companion simulation program — this edition’s model repository (Appendix C). Listed for reproducibility, not as evidence: it computes the consequences of stated assumptions and supports no claim on its own authority. [S29] Terafab official site (accessed Jul 2026):</w:t>
+        <w:t xml:space="preserve">shortfall; ~1,000 automated collision-avoidance maneuvers/day. [S28] Companion simulation program — this edition’s model repository: https://github.com/fperegrinvs/rsi-model (release</w:t>
+      </w:r>
+      <w:r>
+        <w:t xml:space="preserve"> </w:t>
+      </w:r>
+      <w:r>
+        <w:rPr>
+          <w:rStyle w:val="VerbatimChar"/>
+        </w:rPr>
+        <w:t xml:space="preserve">r3.4</w:t>
+      </w:r>
+      <w:r>
+        <w:t xml:space="preserve">; Appendix C). Listed for reproducibility, not as evidence: it computes the consequences of stated assumptions and supports no claim on its own authority. [S29] Terafab official site (accessed Jul 2026):</w:t>
       </w:r>
       <w:r>
         <w:t xml:space="preserve"> </w:t>

</xml_diff>

<commit_message>
Add MIT (code) + CC BY 4.0 (docs) licenses; wire into manuscript, README, CITATION
Co-Authored-By: Claude Fable 5 <noreply@anthropic.com>
</commit_message>
<xml_diff>
--- a/docs/Recursive_Industrial_Intelligence_3rd_Ed_r3.4.docx
+++ b/docs/Recursive_Industrial_Intelligence_3rd_Ed_r3.4.docx
@@ -14489,19 +14489,43 @@
         <w:t xml:space="preserve">CITATION.cff</w:t>
       </w:r>
       <w:r>
-        <w:t xml:space="preserve">. Still pending: a license (the repository is currently</w:t>
-      </w:r>
-      <w:r>
-        <w:t xml:space="preserve"> </w:t>
-      </w:r>
-      <w:r>
-        <w:t xml:space="preserve">all-rights-reserved by default) and an archived DOI snapshot</w:t>
-      </w:r>
-      <w:r>
-        <w:t xml:space="preserve"> </w:t>
-      </w:r>
-      <w:r>
-        <w:t xml:space="preserve">(Zenodo/OSF). The 35 tests establish that the implementation matches its</w:t>
+        <w:t xml:space="preserve">. License: MIT for code (</w:t>
+      </w:r>
+      <w:r>
+        <w:rPr>
+          <w:rStyle w:val="VerbatimChar"/>
+        </w:rPr>
+        <w:t xml:space="preserve">/LICENSE</w:t>
+      </w:r>
+      <w:r>
+        <w:t xml:space="preserve">), CC BY 4.0 for the</w:t>
+      </w:r>
+      <w:r>
+        <w:t xml:space="preserve"> </w:t>
+      </w:r>
+      <w:r>
+        <w:t xml:space="preserve">manuscript and documents (</w:t>
+      </w:r>
+      <w:r>
+        <w:rPr>
+          <w:rStyle w:val="VerbatimChar"/>
+        </w:rPr>
+        <w:t xml:space="preserve">docs/LICENSE</w:t>
+      </w:r>
+      <w:r>
+        <w:t xml:space="preserve">). DOI: minted per release via the</w:t>
+      </w:r>
+      <w:r>
+        <w:t xml:space="preserve"> </w:t>
+      </w:r>
+      <w:r>
+        <w:t xml:space="preserve">Zenodo–GitHub integration (see the repository page for the concept DOI</w:t>
+      </w:r>
+      <w:r>
+        <w:t xml:space="preserve"> </w:t>
+      </w:r>
+      <w:r>
+        <w:t xml:space="preserve">badge). The 35 tests establish that the implementation matches its</w:t>
       </w:r>
       <w:r>
         <w:t xml:space="preserve"> </w:t>

</xml_diff>

<commit_message>
Wire Zenodo DOI (concept 10.5281/zenodo.21619447) into manuscript, README, CITATION
Co-Authored-By: Claude Fable 5 <noreply@anthropic.com>
</commit_message>
<xml_diff>
--- a/docs/Recursive_Industrial_Intelligence_3rd_Ed_r3.4.docx
+++ b/docs/Recursive_Industrial_Intelligence_3rd_Ed_r3.4.docx
@@ -14513,19 +14513,29 @@
         <w:t xml:space="preserve">docs/LICENSE</w:t>
       </w:r>
       <w:r>
-        <w:t xml:space="preserve">). DOI: minted per release via the</w:t>
-      </w:r>
-      <w:r>
-        <w:t xml:space="preserve"> </w:t>
-      </w:r>
-      <w:r>
-        <w:t xml:space="preserve">Zenodo–GitHub integration (see the repository page for the concept DOI</w:t>
-      </w:r>
-      <w:r>
-        <w:t xml:space="preserve"> </w:t>
-      </w:r>
-      <w:r>
-        <w:t xml:space="preserve">badge). The 35 tests establish that the implementation matches its</w:t>
+        <w:t xml:space="preserve">). DOI: concept</w:t>
+      </w:r>
+      <w:r>
+        <w:t xml:space="preserve"> </w:t>
+      </w:r>
+      <w:r>
+        <w:rPr>
+          <w:b/>
+          <w:bCs/>
+        </w:rPr>
+        <w:t xml:space="preserve">10.5281/zenodo.21619447</w:t>
+      </w:r>
+      <w:r>
+        <w:t xml:space="preserve"> </w:t>
+      </w:r>
+      <w:r>
+        <w:t xml:space="preserve">(all versions); this release</w:t>
+      </w:r>
+      <w:r>
+        <w:t xml:space="preserve"> </w:t>
+      </w:r>
+      <w:r>
+        <w:t xml:space="preserve">10.5281/zenodo.21619448. The 35 tests establish that the implementation matches its</w:t>
       </w:r>
       <w:r>
         <w:t xml:space="preserve"> </w:t>
@@ -17534,10 +17544,10 @@
         <w:rPr>
           <w:rStyle w:val="VerbatimChar"/>
         </w:rPr>
-        <w:t xml:space="preserve">r3.4</w:t>
-      </w:r>
-      <w:r>
-        <w:t xml:space="preserve">; Appendix C). Listed for reproducibility, not as evidence: it computes the consequences of stated assumptions and supports no claim on its own authority. [S29] Terafab official site (accessed Jul 2026):</w:t>
+        <w:t xml:space="preserve">r3.4.1</w:t>
+      </w:r>
+      <w:r>
+        <w:t xml:space="preserve">; DOI 10.5281/zenodo.21619447; Appendix C). Listed for reproducibility, not as evidence: it computes the consequences of stated assumptions and supports no claim on its own authority. [S29] Terafab official site (accessed Jul 2026):</w:t>
       </w:r>
       <w:r>
         <w:t xml:space="preserve"> </w:t>

</xml_diff>